<commit_message>
Add 18pt section spacing before each grey header in weekly update output
Sets space_after=360twips (18pt) on the paragraph immediately preceding each
section table (General + I1-I8). This is the standard Word approach: paragraph
spacing controls visual gaps above tables. The grey header boxes are unchanged;
the breathing room appears between the last bullet of each section and the next
header.

Implemented as add_section_spacing() in scripts/convert.py, called after
update_iteration_sections() so it operates on the final bullet positions.

Co-Authored-By: Claude Sonnet 4.6 <noreply@anthropic.com>
</commit_message>
<xml_diff>
--- a/outputs/weekly-updates/Waabanong Weekly Update - Week of 2026-06-15.docx
+++ b/outputs/weekly-updates/Waabanong Weekly Update - Week of 2026-06-15.docx
@@ -1059,6 +1059,7 @@
         <w:rPr>
           <w:lang w:val="en-CA"/>
         </w:rPr>
+        <w:spacing w:after="360"/>
       </w:pPr>
     </w:p>
     <w:tbl>
@@ -1139,6 +1140,7 @@
         <w:rPr>
           <w:lang w:val="en-CA"/>
         </w:rPr>
+        <w:spacing w:after="360"/>
       </w:pPr>
       <w:r>
         <w:t>Internal finance requirements session held June 19 (Marcus, Gabrielle, Rob) — PO workflow design approach confirmed; expense entry from intake/case, auto GL mapping, Finance tab summary view.</w:t>
@@ -1250,6 +1252,7 @@
         <w:rPr>
           <w:lang w:val="en-CA"/>
         </w:rPr>
+        <w:spacing w:after="360"/>
       </w:pPr>
       <w:r>
         <w:t>No infrastructure changes this week — Azure testing environment active and stable for PCFS UAT.</w:t>
@@ -1373,6 +1376,7 @@
         <w:rPr>
           <w:lang w:val="en-CA"/>
         </w:rPr>
+        <w:spacing w:after="360"/>
       </w:pPr>
       <w:r>
         <w:t>Permissions and role assignments refined in preparation for the June 16 UAT session; UAT access confirmed for all PCFS testers.</w:t>
@@ -1561,6 +1565,7 @@
         <w:rPr>
           <w:lang w:val="en-CA"/>
         </w:rPr>
+        <w:spacing w:after="360"/>
       </w:pPr>
       <w:r>
         <w:t>Search result cards updated with clickable functionality and improved accessibility (keyboard navigation, ARIA labels).</w:t>
@@ -1896,6 +1901,7 @@
           <w:lang w:val="en-CA"/>
         </w:rPr>
         <w:ind w:left="720"/>
+        <w:spacing w:after="360"/>
       </w:pPr>
       <w:r>
         <w:t>Save and Send to Supervisor now defaults to the general pool (All) rather than a specific supervisor</w:t>
@@ -2226,6 +2232,7 @@
         <w:rPr>
           <w:lang w:val="en-CA"/>
         </w:rPr>
+        <w:spacing w:after="360"/>
       </w:pPr>
       <w:r>
         <w:t>Document tab updated with document replacement logic.</w:t>
@@ -2383,6 +2390,7 @@
         <w:rPr>
           <w:lang w:val="en-CA"/>
         </w:rPr>
+        <w:spacing w:after="360"/>
       </w:pPr>
       <w:r>
         <w:t>No additional external review this week; Abuse Investigations remains in solution design incorporating PCFS workflows.</w:t>
@@ -2533,6 +2541,7 @@
         <w:rPr>
           <w:lang w:val="en-CA"/>
         </w:rPr>
+        <w:spacing w:after="360"/>
       </w:pPr>
       <w:r>
         <w:t>Data migration planning continues with Campfire, focusing on secure data access approach and privacy requirements for trial migrations.</w:t>
@@ -2747,6 +2756,7 @@
           <w:lang w:val="en-CA"/>
         </w:rPr>
         <w:ind w:left="720"/>
+        <w:spacing w:after="360"/>
       </w:pPr>
       <w:r>
         <w:t>Next step: Rob to review shared finance documentation; follow-up design session to be scheduled</w:t>

</xml_diff>

<commit_message>
Fix section spacing (w:spacing must precede w:rPr); update Jun 15 I4 bullets
- convert.py: _set_space_after() now inserts w:spacing before w:rPr using
  addprevious(). Appending to pPr placed it after w:rPr, which is invalid
  OOXML schema order — Word silently ignored the spacing attribute.
- Both Word outputs regenerated with correct element ordering.
- Jun 15 draft: I4 sub-bullets pared to 5 and summarized per review.

Co-Authored-By: Claude Sonnet 4.6 <noreply@anthropic.com>
</commit_message>
<xml_diff>
--- a/outputs/weekly-updates/Waabanong Weekly Update - Week of 2026-06-15.docx
+++ b/outputs/weekly-updates/Waabanong Weekly Update - Week of 2026-06-15.docx
@@ -1056,10 +1056,10 @@
     </w:tbl>
     <w:p>
       <w:pPr>
-        <w:rPr>
-          <w:lang w:val="en-CA"/>
-        </w:rPr>
         <w:spacing w:after="360"/>
+        <w:rPr>
+          <w:lang w:val="en-CA"/>
+        </w:rPr>
       </w:pPr>
     </w:p>
     <w:tbl>
@@ -1137,10 +1137,10 @@
     <w:p>
       <w:pPr>
         <w:pStyle w:val="list1"/>
-        <w:rPr>
-          <w:lang w:val="en-CA"/>
-        </w:rPr>
         <w:spacing w:after="360"/>
+        <w:rPr>
+          <w:lang w:val="en-CA"/>
+        </w:rPr>
       </w:pPr>
       <w:r>
         <w:t>Internal finance requirements session held June 19 (Marcus, Gabrielle, Rob) — PO workflow design approach confirmed; expense entry from intake/case, auto GL mapping, Finance tab summary view.</w:t>
@@ -1249,10 +1249,10 @@
     <w:p>
       <w:pPr>
         <w:pStyle w:val="list1"/>
-        <w:rPr>
-          <w:lang w:val="en-CA"/>
-        </w:rPr>
         <w:spacing w:after="360"/>
+        <w:rPr>
+          <w:lang w:val="en-CA"/>
+        </w:rPr>
       </w:pPr>
       <w:r>
         <w:t>No infrastructure changes this week — Azure testing environment active and stable for PCFS UAT.</w:t>
@@ -1373,10 +1373,10 @@
     <w:p>
       <w:pPr>
         <w:pStyle w:val="list1"/>
-        <w:rPr>
-          <w:lang w:val="en-CA"/>
-        </w:rPr>
         <w:spacing w:after="360"/>
+        <w:rPr>
+          <w:lang w:val="en-CA"/>
+        </w:rPr>
       </w:pPr>
       <w:r>
         <w:t>Permissions and role assignments refined in preparation for the June 16 UAT session; UAT access confirmed for all PCFS testers.</w:t>
@@ -1562,10 +1562,10 @@
     <w:p>
       <w:pPr>
         <w:pStyle w:val="list1"/>
-        <w:rPr>
-          <w:lang w:val="en-CA"/>
-        </w:rPr>
         <w:spacing w:after="360"/>
+        <w:rPr>
+          <w:lang w:val="en-CA"/>
+        </w:rPr>
       </w:pPr>
       <w:r>
         <w:t>Search result cards updated with clickable functionality and improved accessibility (keyboard navigation, ARIA labels).</w:t>
@@ -1795,7 +1795,7 @@
         </w:rPr>
       </w:pPr>
       <w:r>
-        <w:t>Significant intake additions shipped this period (PR #50):</w:t>
+        <w:t>Significant intake additions shipped this period:</w:t>
       </w:r>
     </w:p>
     <w:p>
@@ -1807,7 +1807,7 @@
         <w:ind w:left="720"/>
       </w:pPr>
       <w:r>
-        <w:t>Director approval step added to Intake Closure workflow</w:t>
+        <w:t>Director approval required for Intake Closure</w:t>
       </w:r>
     </w:p>
     <w:p>
@@ -1819,7 +1819,19 @@
         <w:ind w:left="720"/>
       </w:pPr>
       <w:r>
-        <w:t>Existing intake modal added — workers can view and link related open intakes when initiating a new one</w:t>
+        <w:t>Existing intake modal — view and link related open intakes before creating a new one</w:t>
+      </w:r>
+    </w:p>
+    <w:p>
+      <w:pPr>
+        <w:pStyle w:val="list1"/>
+        <w:rPr>
+          <w:lang w:val="en-CA"/>
+        </w:rPr>
+        <w:ind w:left="720"/>
+      </w:pPr>
+      <w:r>
+        <w:t>Intake Notes carry forward as a case note on escalation</w:t>
       </w:r>
     </w:p>
     <w:p>
@@ -1837,74 +1849,14 @@
     <w:p>
       <w:pPr>
         <w:pStyle w:val="list1"/>
+        <w:spacing w:after="360"/>
         <w:rPr>
           <w:lang w:val="en-CA"/>
         </w:rPr>
         <w:ind w:left="720"/>
       </w:pPr>
       <w:r>
-        <w:t>CFSIS Intake Number implemented with fixed "PCFS" prefix display and format validation</w:t>
-      </w:r>
-    </w:p>
-    <w:p>
-      <w:pPr>
-        <w:pStyle w:val="list1"/>
-        <w:rPr>
-          <w:lang w:val="en-CA"/>
-        </w:rPr>
-        <w:ind w:left="720"/>
-      </w:pPr>
-      <w:r>
-        <w:t>Intake Notes field added — notes entered at intake automatically carry forward as a case note on escalation</w:t>
-      </w:r>
-    </w:p>
-    <w:p>
-      <w:pPr>
-        <w:pStyle w:val="list1"/>
-        <w:rPr>
-          <w:lang w:val="en-CA"/>
-        </w:rPr>
-        <w:ind w:left="720"/>
-      </w:pPr>
-      <w:r>
-        <w:t>Actions Taken section notes field improvements</w:t>
-      </w:r>
-    </w:p>
-    <w:p>
-      <w:pPr>
-        <w:pStyle w:val="list1"/>
-        <w:rPr>
-          <w:lang w:val="en-CA"/>
-        </w:rPr>
-        <w:ind w:left="720"/>
-      </w:pPr>
-      <w:r>
-        <w:t>Fixed: intake and case file records not appearing in person search results</w:t>
-      </w:r>
-    </w:p>
-    <w:p>
-      <w:pPr>
-        <w:pStyle w:val="list1"/>
-        <w:rPr>
-          <w:lang w:val="en-CA"/>
-        </w:rPr>
-        <w:ind w:left="720"/>
-      </w:pPr>
-      <w:r>
-        <w:t>Intake form section anchoring added for smoother in-page navigation</w:t>
-      </w:r>
-    </w:p>
-    <w:p>
-      <w:pPr>
-        <w:pStyle w:val="list1"/>
-        <w:rPr>
-          <w:lang w:val="en-CA"/>
-        </w:rPr>
-        <w:ind w:left="720"/>
-        <w:spacing w:after="360"/>
-      </w:pPr>
-      <w:r>
-        <w:t>Save and Send to Supervisor now defaults to the general pool (All) rather than a specific supervisor</w:t>
+        <w:t>CFSIS Intake Number with fixed "PCFS" prefix and format validation</w:t>
       </w:r>
     </w:p>
     <w:tbl>
@@ -2177,7 +2129,7 @@
         </w:rPr>
       </w:pPr>
       <w:r>
-        <w:t>Case file permissions fully implemented and merged (PR #49) — role-based visibility and action controls now enforced across case file views.</w:t>
+        <w:t>Case file permissions fully implemented and merged — role-based visibility and action controls now enforced across case file views.</w:t>
       </w:r>
     </w:p>
     <w:p>
@@ -2229,10 +2181,10 @@
     <w:p>
       <w:pPr>
         <w:pStyle w:val="list1"/>
-        <w:rPr>
-          <w:lang w:val="en-CA"/>
-        </w:rPr>
         <w:spacing w:after="360"/>
+        <w:rPr>
+          <w:lang w:val="en-CA"/>
+        </w:rPr>
       </w:pPr>
       <w:r>
         <w:t>Document tab updated with document replacement logic.</w:t>
@@ -2387,10 +2339,10 @@
     <w:p>
       <w:pPr>
         <w:pStyle w:val="list1"/>
-        <w:rPr>
-          <w:lang w:val="en-CA"/>
-        </w:rPr>
         <w:spacing w:after="360"/>
+        <w:rPr>
+          <w:lang w:val="en-CA"/>
+        </w:rPr>
       </w:pPr>
       <w:r>
         <w:t>No additional external review this week; Abuse Investigations remains in solution design incorporating PCFS workflows.</w:t>
@@ -2538,10 +2490,10 @@
     <w:p>
       <w:pPr>
         <w:pStyle w:val="list1"/>
-        <w:rPr>
-          <w:lang w:val="en-CA"/>
-        </w:rPr>
         <w:spacing w:after="360"/>
+        <w:rPr>
+          <w:lang w:val="en-CA"/>
+        </w:rPr>
       </w:pPr>
       <w:r>
         <w:t>Data migration planning continues with Campfire, focusing on secure data access approach and privacy requirements for trial migrations.</w:t>
@@ -2752,11 +2704,11 @@
     <w:p>
       <w:pPr>
         <w:pStyle w:val="list1"/>
+        <w:spacing w:after="360"/>
         <w:rPr>
           <w:lang w:val="en-CA"/>
         </w:rPr>
         <w:ind w:left="720"/>
-        <w:spacing w:after="360"/>
       </w:pPr>
       <w:r>
         <w:t>Next step: Rob to review shared finance documentation; follow-up design session to be scheduled</w:t>

</xml_diff>

<commit_message>
Carry Features boxes from base document unchanged; don't recreate from markdown
Recreating Features content from markdown lost bullet styles and cell formatting.
Since Features are static, the base document's correctly-formatted cells are now
left untouched during conversion.

Co-Authored-By: Claude Sonnet 4.6 <noreply@anthropic.com>
</commit_message>
<xml_diff>
--- a/outputs/weekly-updates/Waabanong Weekly Update - Week of 2026-06-15.docx
+++ b/outputs/weekly-updates/Waabanong Weekly Update - Week of 2026-06-15.docx
@@ -1218,14 +1218,17 @@
           </w:p>
           <w:p>
             <w:pPr>
-              <w:pStyle w:val="Section"/>
-              <w:rPr>
-                <w:b/>
-                <w:bCs/>
-                <w:lang w:val="en-CA"/>
-              </w:rPr>
-            </w:pPr>
-            <w:r>
+              <w:pStyle w:val="list1"/>
+              <w:rPr>
+                <w:lang w:val="en-CA"/>
+              </w:rPr>
+            </w:pPr>
+            <w:r>
+              <w:rPr>
+                <w:b w:val="0"/>
+                <w:bCs w:val="0"/>
+                <w:lang w:val="en-CA"/>
+              </w:rPr>
               <w:t>Set up Development, Testing, and Production environments</w:t>
             </w:r>
           </w:p>
@@ -1329,27 +1332,35 @@
           </w:p>
           <w:p>
             <w:pPr>
-              <w:pStyle w:val="Section"/>
-              <w:rPr>
-                <w:b/>
-                <w:bCs/>
-                <w:lang w:val="en-CA"/>
-              </w:rPr>
-            </w:pPr>
-            <w:r>
+              <w:pStyle w:val="list1"/>
+              <w:rPr>
+                <w:b w:val="0"/>
+                <w:bCs w:val="0"/>
+                <w:lang w:val="en-CA"/>
+              </w:rPr>
+            </w:pPr>
+            <w:r>
+              <w:rPr>
+                <w:b w:val="0"/>
+                <w:bCs w:val="0"/>
+                <w:lang w:val="en-CA"/>
+              </w:rPr>
               <w:t>Microsoft 365–based authentication</w:t>
             </w:r>
           </w:p>
           <w:p>
             <w:pPr>
-              <w:pStyle w:val="Section"/>
-              <w:rPr>
-                <w:b/>
-                <w:bCs/>
-                <w:lang w:val="en-CA"/>
-              </w:rPr>
-            </w:pPr>
-            <w:r>
+              <w:pStyle w:val="list1"/>
+              <w:rPr>
+                <w:lang w:val="en-CA"/>
+              </w:rPr>
+            </w:pPr>
+            <w:r>
+              <w:rPr>
+                <w:b w:val="0"/>
+                <w:bCs w:val="0"/>
+                <w:lang w:val="en-CA"/>
+              </w:rPr>
               <w:t>User login</w:t>
             </w:r>
           </w:p>
@@ -1453,81 +1464,129 @@
           </w:p>
           <w:p>
             <w:pPr>
-              <w:pStyle w:val="Section"/>
-              <w:rPr>
-                <w:b/>
-                <w:bCs/>
-                <w:lang w:val="en-CA"/>
-              </w:rPr>
-            </w:pPr>
-            <w:r>
+              <w:pStyle w:val="list1"/>
+              <w:numPr>
+                <w:ilvl w:val="0"/>
+                <w:numId w:val="15"/>
+              </w:numPr>
+              <w:rPr>
+                <w:b w:val="0"/>
+                <w:bCs w:val="0"/>
+                <w:lang w:val="en-CA"/>
+              </w:rPr>
+            </w:pPr>
+            <w:r>
+              <w:rPr>
+                <w:b w:val="0"/>
+                <w:bCs w:val="0"/>
+                <w:lang w:val="en-CA"/>
+              </w:rPr>
               <w:t>Centralized person records (children, adults, limited profiles)</w:t>
             </w:r>
           </w:p>
           <w:p>
             <w:pPr>
-              <w:pStyle w:val="Section"/>
-              <w:rPr>
-                <w:b/>
-                <w:bCs/>
-                <w:lang w:val="en-CA"/>
-              </w:rPr>
-              <w:ind w:left="720"/>
-            </w:pPr>
-            <w:r>
+              <w:pStyle w:val="list1"/>
+              <w:numPr>
+                <w:ilvl w:val="1"/>
+                <w:numId w:val="8"/>
+              </w:numPr>
+              <w:rPr>
+                <w:b w:val="0"/>
+                <w:bCs w:val="0"/>
+                <w:lang w:val="en-CA"/>
+              </w:rPr>
+            </w:pPr>
+            <w:r>
+              <w:rPr>
+                <w:b w:val="0"/>
+                <w:bCs w:val="0"/>
+                <w:lang w:val="en-CA"/>
+              </w:rPr>
               <w:t>Duplicate prevention</w:t>
             </w:r>
           </w:p>
           <w:p>
             <w:pPr>
-              <w:pStyle w:val="Section"/>
-              <w:rPr>
-                <w:b/>
-                <w:bCs/>
-                <w:lang w:val="en-CA"/>
-              </w:rPr>
-            </w:pPr>
-            <w:r>
+              <w:pStyle w:val="list1"/>
+              <w:numPr>
+                <w:ilvl w:val="0"/>
+                <w:numId w:val="15"/>
+              </w:numPr>
+              <w:rPr>
+                <w:b w:val="0"/>
+                <w:bCs w:val="0"/>
+                <w:lang w:val="en-CA"/>
+              </w:rPr>
+            </w:pPr>
+            <w:r>
+              <w:rPr>
+                <w:b w:val="0"/>
+                <w:bCs w:val="0"/>
+                <w:lang w:val="en-CA"/>
+              </w:rPr>
               <w:t>Family and household structures</w:t>
             </w:r>
           </w:p>
           <w:p>
             <w:pPr>
-              <w:pStyle w:val="Section"/>
-              <w:rPr>
-                <w:b/>
-                <w:bCs/>
-                <w:lang w:val="en-CA"/>
-              </w:rPr>
-              <w:ind w:left="720"/>
-            </w:pPr>
-            <w:r>
+              <w:pStyle w:val="list1"/>
+              <w:numPr>
+                <w:ilvl w:val="1"/>
+                <w:numId w:val="15"/>
+              </w:numPr>
+              <w:rPr>
+                <w:b w:val="0"/>
+                <w:bCs w:val="0"/>
+                <w:lang w:val="en-CA"/>
+              </w:rPr>
+            </w:pPr>
+            <w:r>
+              <w:rPr>
+                <w:b w:val="0"/>
+                <w:bCs w:val="0"/>
+                <w:lang w:val="en-CA"/>
+              </w:rPr>
               <w:t>Multi-generation relationships</w:t>
             </w:r>
           </w:p>
           <w:p>
             <w:pPr>
-              <w:pStyle w:val="Section"/>
-              <w:rPr>
-                <w:b/>
-                <w:bCs/>
-                <w:lang w:val="en-CA"/>
-              </w:rPr>
-            </w:pPr>
-            <w:r>
+              <w:pStyle w:val="list1"/>
+              <w:rPr>
+                <w:b w:val="0"/>
+                <w:bCs w:val="0"/>
+                <w:lang w:val="en-CA"/>
+              </w:rPr>
+            </w:pPr>
+            <w:r>
+              <w:rPr>
+                <w:b w:val="0"/>
+                <w:bCs w:val="0"/>
+                <w:lang w:val="en-CA"/>
+              </w:rPr>
               <w:t>Reciprocal relationship logic</w:t>
             </w:r>
           </w:p>
           <w:p>
             <w:pPr>
-              <w:pStyle w:val="Section"/>
-              <w:rPr>
-                <w:b/>
-                <w:bCs/>
-                <w:lang w:val="en-CA"/>
-              </w:rPr>
-            </w:pPr>
-            <w:r>
+              <w:pStyle w:val="list1"/>
+              <w:numPr>
+                <w:ilvl w:val="0"/>
+                <w:numId w:val="15"/>
+              </w:numPr>
+              <w:rPr>
+                <w:b w:val="0"/>
+                <w:bCs w:val="0"/>
+                <w:lang w:val="en-CA"/>
+              </w:rPr>
+            </w:pPr>
+            <w:r>
+              <w:rPr>
+                <w:b w:val="0"/>
+                <w:bCs w:val="0"/>
+                <w:lang w:val="en-CA"/>
+              </w:rPr>
               <w:t>Global search across people and families</w:t>
             </w:r>
           </w:p>
@@ -1642,120 +1701,199 @@
           </w:p>
           <w:p>
             <w:pPr>
-              <w:pStyle w:val="Section"/>
-              <w:rPr>
-                <w:b/>
-                <w:bCs/>
-                <w:lang w:val="en-CA"/>
-              </w:rPr>
-            </w:pPr>
-            <w:r>
+              <w:pStyle w:val="list1"/>
+              <w:numPr>
+                <w:ilvl w:val="0"/>
+                <w:numId w:val="15"/>
+              </w:numPr>
+              <w:rPr>
+                <w:b w:val="0"/>
+                <w:bCs w:val="0"/>
+                <w:lang w:val="en-CA"/>
+              </w:rPr>
+            </w:pPr>
+            <w:r>
+              <w:rPr>
+                <w:b w:val="0"/>
+                <w:bCs w:val="0"/>
+                <w:lang w:val="en-CA"/>
+              </w:rPr>
               <w:t>Structured intake workflows with mandatory fields</w:t>
             </w:r>
           </w:p>
           <w:p>
             <w:pPr>
-              <w:pStyle w:val="Section"/>
-              <w:rPr>
-                <w:b/>
-                <w:bCs/>
-                <w:lang w:val="en-CA"/>
-              </w:rPr>
-            </w:pPr>
-            <w:r>
+              <w:pStyle w:val="list1"/>
+              <w:numPr>
+                <w:ilvl w:val="0"/>
+                <w:numId w:val="15"/>
+              </w:numPr>
+              <w:rPr>
+                <w:b w:val="0"/>
+                <w:bCs w:val="0"/>
+                <w:lang w:val="en-CA"/>
+              </w:rPr>
+            </w:pPr>
+            <w:r>
+              <w:rPr>
+                <w:b w:val="0"/>
+                <w:bCs w:val="0"/>
+                <w:lang w:val="en-CA"/>
+              </w:rPr>
               <w:t>Intake status tracking and lifecycle</w:t>
             </w:r>
           </w:p>
           <w:p>
             <w:pPr>
-              <w:pStyle w:val="Section"/>
-              <w:rPr>
-                <w:b/>
-                <w:bCs/>
-                <w:lang w:val="en-CA"/>
-              </w:rPr>
-            </w:pPr>
-            <w:r>
+              <w:pStyle w:val="list1"/>
+              <w:numPr>
+                <w:ilvl w:val="0"/>
+                <w:numId w:val="15"/>
+              </w:numPr>
+              <w:rPr>
+                <w:b w:val="0"/>
+                <w:bCs w:val="0"/>
+                <w:lang w:val="en-CA"/>
+              </w:rPr>
+            </w:pPr>
+            <w:r>
+              <w:rPr>
+                <w:b w:val="0"/>
+                <w:bCs w:val="0"/>
+                <w:lang w:val="en-CA"/>
+              </w:rPr>
               <w:t>Supervisor review and approval processes</w:t>
             </w:r>
           </w:p>
           <w:p>
             <w:pPr>
-              <w:pStyle w:val="Section"/>
-              <w:rPr>
-                <w:b/>
-                <w:bCs/>
-                <w:lang w:val="en-CA"/>
-              </w:rPr>
-            </w:pPr>
-            <w:r>
+              <w:pStyle w:val="list1"/>
+              <w:numPr>
+                <w:ilvl w:val="0"/>
+                <w:numId w:val="15"/>
+              </w:numPr>
+              <w:rPr>
+                <w:b w:val="0"/>
+                <w:bCs w:val="0"/>
+                <w:lang w:val="en-CA"/>
+              </w:rPr>
+            </w:pPr>
+            <w:r>
+              <w:rPr>
+                <w:b w:val="0"/>
+                <w:bCs w:val="0"/>
+                <w:lang w:val="en-CA"/>
+              </w:rPr>
               <w:t>Ability to resolve intake without opening a case</w:t>
             </w:r>
           </w:p>
           <w:p>
             <w:pPr>
-              <w:pStyle w:val="Section"/>
-              <w:rPr>
-                <w:b/>
-                <w:bCs/>
-                <w:lang w:val="en-CA"/>
-              </w:rPr>
-            </w:pPr>
-            <w:r>
+              <w:pStyle w:val="list1"/>
+              <w:numPr>
+                <w:ilvl w:val="0"/>
+                <w:numId w:val="15"/>
+              </w:numPr>
+              <w:rPr>
+                <w:b w:val="0"/>
+                <w:bCs w:val="0"/>
+                <w:lang w:val="en-CA"/>
+              </w:rPr>
+            </w:pPr>
+            <w:r>
+              <w:rPr>
+                <w:b w:val="0"/>
+                <w:bCs w:val="0"/>
+                <w:lang w:val="en-CA"/>
+              </w:rPr>
               <w:t>Escalation from intake to case creation</w:t>
             </w:r>
           </w:p>
           <w:p>
             <w:pPr>
-              <w:pStyle w:val="Section"/>
-              <w:rPr>
-                <w:b/>
-                <w:bCs/>
-                <w:lang w:val="en-CA"/>
-              </w:rPr>
-            </w:pPr>
-            <w:r>
+              <w:pStyle w:val="list1"/>
+              <w:numPr>
+                <w:ilvl w:val="0"/>
+                <w:numId w:val="15"/>
+              </w:numPr>
+              <w:rPr>
+                <w:b w:val="0"/>
+                <w:bCs w:val="0"/>
+                <w:lang w:val="en-CA"/>
+              </w:rPr>
+            </w:pPr>
+            <w:r>
+              <w:rPr>
+                <w:b w:val="0"/>
+                <w:bCs w:val="0"/>
+                <w:lang w:val="en-CA"/>
+              </w:rPr>
               <w:t>Printable intake records</w:t>
             </w:r>
           </w:p>
           <w:p>
             <w:pPr>
-              <w:pStyle w:val="Section"/>
-              <w:rPr>
-                <w:b/>
-                <w:bCs/>
-                <w:lang w:val="en-CA"/>
-              </w:rPr>
-            </w:pPr>
-            <w:r>
+              <w:pStyle w:val="list1"/>
+              <w:numPr>
+                <w:ilvl w:val="0"/>
+                <w:numId w:val="15"/>
+              </w:numPr>
+              <w:rPr>
+                <w:b w:val="0"/>
+                <w:bCs w:val="0"/>
+                <w:lang w:val="en-CA"/>
+              </w:rPr>
+            </w:pPr>
+            <w:r>
+              <w:rPr>
+                <w:b w:val="0"/>
+                <w:bCs w:val="0"/>
+                <w:lang w:val="en-CA"/>
+              </w:rPr>
               <w:t>Automated notifications:</w:t>
             </w:r>
           </w:p>
           <w:p>
             <w:pPr>
-              <w:pStyle w:val="Section"/>
-              <w:rPr>
-                <w:b/>
-                <w:bCs/>
-                <w:lang w:val="en-CA"/>
-              </w:rPr>
-              <w:ind w:left="720"/>
-            </w:pPr>
-            <w:r>
+              <w:pStyle w:val="list1"/>
+              <w:numPr>
+                <w:ilvl w:val="1"/>
+                <w:numId w:val="15"/>
+              </w:numPr>
+              <w:rPr>
+                <w:b w:val="0"/>
+                <w:bCs w:val="0"/>
+                <w:lang w:val="en-CA"/>
+              </w:rPr>
+            </w:pPr>
+            <w:r>
+              <w:rPr>
+                <w:b w:val="0"/>
+                <w:bCs w:val="0"/>
+                <w:lang w:val="en-CA"/>
+              </w:rPr>
               <w:t>In-application alerts</w:t>
             </w:r>
           </w:p>
           <w:p>
             <w:pPr>
-              <w:pStyle w:val="Section"/>
-              <w:rPr>
-                <w:b/>
-                <w:bCs/>
-                <w:lang w:val="en-CA"/>
-              </w:rPr>
-              <w:ind w:left="720"/>
-            </w:pPr>
-            <w:r>
+              <w:pStyle w:val="list1"/>
+              <w:numPr>
+                <w:ilvl w:val="1"/>
+                <w:numId w:val="15"/>
+              </w:numPr>
+              <w:rPr>
+                <w:b w:val="0"/>
+                <w:bCs w:val="0"/>
+                <w:lang w:val="en-CA"/>
+              </w:rPr>
+            </w:pPr>
+            <w:r>
+              <w:rPr>
+                <w:b w:val="0"/>
+                <w:bCs w:val="0"/>
+                <w:lang w:val="en-CA"/>
+              </w:rPr>
               <w:t>Defined external channels (email/messaging)</w:t>
             </w:r>
           </w:p>
@@ -1945,162 +2083,241 @@
           </w:p>
           <w:p>
             <w:pPr>
-              <w:pStyle w:val="Section"/>
-              <w:rPr>
-                <w:b/>
-                <w:bCs/>
-                <w:lang w:val="en-CA"/>
-              </w:rPr>
-            </w:pPr>
-            <w:r>
+              <w:pStyle w:val="list1"/>
+              <w:rPr>
+                <w:b w:val="0"/>
+                <w:bCs w:val="0"/>
+                <w:lang w:val="en-CA"/>
+              </w:rPr>
+            </w:pPr>
+            <w:r>
+              <w:rPr>
+                <w:b w:val="0"/>
+                <w:bCs w:val="0"/>
+                <w:lang w:val="en-CA"/>
+              </w:rPr>
               <w:t>Case file creation and lifecycle management</w:t>
             </w:r>
           </w:p>
           <w:p>
             <w:pPr>
-              <w:pStyle w:val="Section"/>
-              <w:rPr>
-                <w:b/>
-                <w:bCs/>
-                <w:lang w:val="en-CA"/>
-              </w:rPr>
-            </w:pPr>
-            <w:r>
+              <w:pStyle w:val="list1"/>
+              <w:rPr>
+                <w:b w:val="0"/>
+                <w:bCs w:val="0"/>
+                <w:lang w:val="en-CA"/>
+              </w:rPr>
+            </w:pPr>
+            <w:r>
+              <w:rPr>
+                <w:b w:val="0"/>
+                <w:bCs w:val="0"/>
+                <w:lang w:val="en-CA"/>
+              </w:rPr>
               <w:t>Assignment of caseworkers and supervisors</w:t>
             </w:r>
           </w:p>
           <w:p>
             <w:pPr>
-              <w:pStyle w:val="Section"/>
-              <w:rPr>
-                <w:b/>
-                <w:bCs/>
-                <w:lang w:val="en-CA"/>
-              </w:rPr>
-            </w:pPr>
-            <w:r>
+              <w:pStyle w:val="list1"/>
+              <w:rPr>
+                <w:b w:val="0"/>
+                <w:bCs w:val="0"/>
+                <w:lang w:val="en-CA"/>
+              </w:rPr>
+            </w:pPr>
+            <w:r>
+              <w:rPr>
+                <w:b w:val="0"/>
+                <w:bCs w:val="0"/>
+                <w:lang w:val="en-CA"/>
+              </w:rPr>
               <w:t>Case reassignment with approval</w:t>
             </w:r>
           </w:p>
           <w:p>
             <w:pPr>
-              <w:pStyle w:val="Section"/>
-              <w:rPr>
-                <w:b/>
-                <w:bCs/>
-                <w:lang w:val="en-CA"/>
-              </w:rPr>
-            </w:pPr>
-            <w:r>
+              <w:pStyle w:val="list1"/>
+              <w:rPr>
+                <w:b w:val="0"/>
+                <w:bCs w:val="0"/>
+                <w:lang w:val="en-CA"/>
+              </w:rPr>
+            </w:pPr>
+            <w:r>
+              <w:rPr>
+                <w:b w:val="0"/>
+                <w:bCs w:val="0"/>
+                <w:lang w:val="en-CA"/>
+              </w:rPr>
               <w:t>Signs of Safety–aligned workflows, including:</w:t>
             </w:r>
           </w:p>
           <w:p>
             <w:pPr>
-              <w:pStyle w:val="Section"/>
-              <w:rPr>
-                <w:b/>
-                <w:bCs/>
-                <w:lang w:val="en-CA"/>
-              </w:rPr>
-              <w:ind w:left="720"/>
-            </w:pPr>
-            <w:r>
+              <w:pStyle w:val="list1"/>
+              <w:numPr>
+                <w:ilvl w:val="1"/>
+                <w:numId w:val="8"/>
+              </w:numPr>
+              <w:rPr>
+                <w:b w:val="0"/>
+                <w:bCs w:val="0"/>
+                <w:lang w:val="en-CA"/>
+              </w:rPr>
+            </w:pPr>
+            <w:r>
+              <w:rPr>
+                <w:b w:val="0"/>
+                <w:bCs w:val="0"/>
+                <w:lang w:val="en-CA"/>
+              </w:rPr>
               <w:t>Placement</w:t>
             </w:r>
           </w:p>
           <w:p>
             <w:pPr>
-              <w:pStyle w:val="Section"/>
-              <w:rPr>
-                <w:b/>
-                <w:bCs/>
-                <w:lang w:val="en-CA"/>
-              </w:rPr>
-              <w:ind w:left="720"/>
-            </w:pPr>
-            <w:r>
+              <w:pStyle w:val="list1"/>
+              <w:numPr>
+                <w:ilvl w:val="1"/>
+                <w:numId w:val="8"/>
+              </w:numPr>
+              <w:rPr>
+                <w:b w:val="0"/>
+                <w:bCs w:val="0"/>
+                <w:lang w:val="en-CA"/>
+              </w:rPr>
+            </w:pPr>
+            <w:r>
+              <w:rPr>
+                <w:b w:val="0"/>
+                <w:bCs w:val="0"/>
+                <w:lang w:val="en-CA"/>
+              </w:rPr>
               <w:t>Structured assessments</w:t>
             </w:r>
           </w:p>
           <w:p>
             <w:pPr>
-              <w:pStyle w:val="Section"/>
-              <w:rPr>
-                <w:b/>
-                <w:bCs/>
-                <w:lang w:val="en-CA"/>
-              </w:rPr>
-              <w:ind w:left="720"/>
-            </w:pPr>
-            <w:r>
+              <w:pStyle w:val="list1"/>
+              <w:numPr>
+                <w:ilvl w:val="1"/>
+                <w:numId w:val="8"/>
+              </w:numPr>
+              <w:rPr>
+                <w:b w:val="0"/>
+                <w:bCs w:val="0"/>
+                <w:lang w:val="en-CA"/>
+              </w:rPr>
+            </w:pPr>
+            <w:r>
+              <w:rPr>
+                <w:b w:val="0"/>
+                <w:bCs w:val="0"/>
+                <w:lang w:val="en-CA"/>
+              </w:rPr>
               <w:t>Safety goals and planning</w:t>
             </w:r>
           </w:p>
           <w:p>
             <w:pPr>
-              <w:pStyle w:val="Section"/>
-              <w:rPr>
-                <w:b/>
-                <w:bCs/>
-                <w:lang w:val="en-CA"/>
-              </w:rPr>
-              <w:ind w:left="720"/>
-            </w:pPr>
-            <w:r>
+              <w:pStyle w:val="list1"/>
+              <w:numPr>
+                <w:ilvl w:val="1"/>
+                <w:numId w:val="8"/>
+              </w:numPr>
+              <w:rPr>
+                <w:b w:val="0"/>
+                <w:bCs w:val="0"/>
+                <w:lang w:val="en-CA"/>
+              </w:rPr>
+            </w:pPr>
+            <w:r>
+              <w:rPr>
+                <w:b w:val="0"/>
+                <w:bCs w:val="0"/>
+                <w:lang w:val="en-CA"/>
+              </w:rPr>
               <w:t>Ongoing review checkpoints</w:t>
             </w:r>
           </w:p>
           <w:p>
             <w:pPr>
-              <w:pStyle w:val="Section"/>
-              <w:rPr>
-                <w:b/>
-                <w:bCs/>
-                <w:lang w:val="en-CA"/>
-              </w:rPr>
-            </w:pPr>
-            <w:r>
+              <w:pStyle w:val="list1"/>
+              <w:numPr>
+                <w:ilvl w:val="0"/>
+                <w:numId w:val="15"/>
+              </w:numPr>
+              <w:rPr>
+                <w:b w:val="0"/>
+                <w:bCs w:val="0"/>
+                <w:lang w:val="en-CA"/>
+              </w:rPr>
+            </w:pPr>
+            <w:r>
+              <w:rPr>
+                <w:b w:val="0"/>
+                <w:bCs w:val="0"/>
+                <w:lang w:val="en-CA"/>
+              </w:rPr>
               <w:t>Visibility into historical and related cases</w:t>
             </w:r>
           </w:p>
           <w:p>
             <w:pPr>
-              <w:pStyle w:val="Section"/>
-              <w:rPr>
-                <w:b/>
-                <w:bCs/>
-                <w:lang w:val="en-CA"/>
-              </w:rPr>
-            </w:pPr>
-            <w:r>
+              <w:pStyle w:val="list1"/>
+              <w:rPr>
+                <w:b w:val="0"/>
+                <w:bCs w:val="0"/>
+                <w:lang w:val="en-CA"/>
+              </w:rPr>
+            </w:pPr>
+            <w:r>
+              <w:rPr>
+                <w:b w:val="0"/>
+                <w:bCs w:val="0"/>
+                <w:lang w:val="en-CA"/>
+              </w:rPr>
               <w:t>Case notes for visits, services, and interactions</w:t>
             </w:r>
           </w:p>
           <w:p>
             <w:pPr>
-              <w:pStyle w:val="Section"/>
-              <w:rPr>
-                <w:b/>
-                <w:bCs/>
-                <w:lang w:val="en-CA"/>
-              </w:rPr>
-            </w:pPr>
-            <w:r>
+              <w:pStyle w:val="list1"/>
+              <w:rPr>
+                <w:b w:val="0"/>
+                <w:bCs w:val="0"/>
+                <w:lang w:val="en-CA"/>
+              </w:rPr>
+            </w:pPr>
+            <w:r>
+              <w:rPr>
+                <w:b w:val="0"/>
+                <w:bCs w:val="0"/>
+                <w:lang w:val="en-CA"/>
+              </w:rPr>
               <w:t>Communication tracking across intake and case contexts</w:t>
             </w:r>
           </w:p>
           <w:p>
             <w:pPr>
-              <w:pStyle w:val="Section"/>
-              <w:rPr>
-                <w:b/>
-                <w:bCs/>
-                <w:lang w:val="en-CA"/>
-              </w:rPr>
-              <w:ind w:left="720"/>
-            </w:pPr>
-            <w:r>
+              <w:pStyle w:val="list1"/>
+              <w:numPr>
+                <w:ilvl w:val="1"/>
+                <w:numId w:val="15"/>
+              </w:numPr>
+              <w:rPr>
+                <w:b w:val="0"/>
+                <w:bCs w:val="0"/>
+                <w:lang w:val="en-CA"/>
+              </w:rPr>
+            </w:pPr>
+            <w:r>
+              <w:rPr>
+                <w:b w:val="0"/>
+                <w:bCs w:val="0"/>
+                <w:lang w:val="en-CA"/>
+              </w:rPr>
               <w:t>Document management: Person, Intake &amp; Case</w:t>
             </w:r>
           </w:p>
@@ -2269,40 +2486,95 @@
           </w:p>
           <w:p>
             <w:pPr>
-              <w:pStyle w:val="Section"/>
-              <w:rPr>
-                <w:b/>
-                <w:bCs/>
-                <w:lang w:val="en-CA"/>
-              </w:rPr>
-            </w:pPr>
-            <w:r>
-              <w:t>Triggers and integration with Intake module</w:t>
-            </w:r>
-          </w:p>
-          <w:p>
-            <w:pPr>
-              <w:pStyle w:val="Section"/>
-              <w:rPr>
-                <w:b/>
-                <w:bCs/>
-                <w:lang w:val="en-CA"/>
-              </w:rPr>
-            </w:pPr>
-            <w:r>
-              <w:t>Investigation workflow</w:t>
-            </w:r>
-          </w:p>
-          <w:p>
-            <w:pPr>
-              <w:pStyle w:val="Section"/>
-              <w:rPr>
-                <w:b/>
-                <w:bCs/>
-                <w:lang w:val="en-CA"/>
-              </w:rPr>
-            </w:pPr>
-            <w:r>
+              <w:pStyle w:val="list1"/>
+              <w:rPr>
+                <w:b w:val="0"/>
+                <w:bCs w:val="0"/>
+                <w:lang w:val="en-CA"/>
+              </w:rPr>
+            </w:pPr>
+            <w:r>
+              <w:rPr>
+                <w:b w:val="0"/>
+                <w:bCs w:val="0"/>
+                <w:lang w:val="en-CA"/>
+              </w:rPr>
+              <w:t>Trigger</w:t>
+            </w:r>
+            <w:r>
+              <w:rPr>
+                <w:b w:val="0"/>
+                <w:bCs w:val="0"/>
+                <w:lang w:val="en-CA"/>
+              </w:rPr>
+              <w:t>s and integration with</w:t>
+            </w:r>
+            <w:r>
+              <w:rPr>
+                <w:b w:val="0"/>
+                <w:bCs w:val="0"/>
+                <w:lang w:val="en-CA"/>
+              </w:rPr>
+              <w:t xml:space="preserve"> Intake</w:t>
+            </w:r>
+            <w:r>
+              <w:rPr>
+                <w:b w:val="0"/>
+                <w:bCs w:val="0"/>
+                <w:lang w:val="en-CA"/>
+              </w:rPr>
+              <w:t xml:space="preserve"> module</w:t>
+            </w:r>
+          </w:p>
+          <w:p>
+            <w:pPr>
+              <w:pStyle w:val="list1"/>
+              <w:rPr>
+                <w:b w:val="0"/>
+                <w:bCs w:val="0"/>
+                <w:lang w:val="en-CA"/>
+              </w:rPr>
+            </w:pPr>
+            <w:r>
+              <w:rPr>
+                <w:b w:val="0"/>
+                <w:bCs w:val="0"/>
+                <w:lang w:val="en-CA"/>
+              </w:rPr>
+              <w:t>Investigation wor</w:t>
+            </w:r>
+            <w:r>
+              <w:rPr>
+                <w:b w:val="0"/>
+                <w:bCs w:val="0"/>
+                <w:lang w:val="en-CA"/>
+              </w:rPr>
+              <w:t>k</w:t>
+            </w:r>
+            <w:r>
+              <w:rPr>
+                <w:b w:val="0"/>
+                <w:bCs w:val="0"/>
+                <w:lang w:val="en-CA"/>
+              </w:rPr>
+              <w:t>flow</w:t>
+            </w:r>
+          </w:p>
+          <w:p>
+            <w:pPr>
+              <w:pStyle w:val="list1"/>
+              <w:rPr>
+                <w:b w:val="0"/>
+                <w:bCs w:val="0"/>
+                <w:lang w:val="en-CA"/>
+              </w:rPr>
+            </w:pPr>
+            <w:r>
+              <w:rPr>
+                <w:b w:val="0"/>
+                <w:bCs w:val="0"/>
+                <w:lang w:val="en-CA"/>
+              </w:rPr>
               <w:t>Investigation document management</w:t>
             </w:r>
           </w:p>
@@ -2420,54 +2692,74 @@
           </w:p>
           <w:p>
             <w:pPr>
-              <w:pStyle w:val="Section"/>
-              <w:rPr>
-                <w:b/>
-                <w:bCs/>
-                <w:lang w:val="en-CA"/>
-              </w:rPr>
-            </w:pPr>
-            <w:r>
+              <w:pStyle w:val="list1"/>
+              <w:rPr>
+                <w:b w:val="0"/>
+                <w:bCs w:val="0"/>
+                <w:lang w:val="en-CA"/>
+              </w:rPr>
+            </w:pPr>
+            <w:r>
+              <w:rPr>
+                <w:b w:val="0"/>
+                <w:bCs w:val="0"/>
+                <w:lang w:val="en-CA"/>
+              </w:rPr>
               <w:t>Develop a data migration strategy from FAMCare into Waabanong</w:t>
             </w:r>
           </w:p>
           <w:p>
             <w:pPr>
-              <w:pStyle w:val="Section"/>
-              <w:rPr>
-                <w:b/>
-                <w:bCs/>
-                <w:lang w:val="en-CA"/>
-              </w:rPr>
-            </w:pPr>
-            <w:r>
+              <w:pStyle w:val="list1"/>
+              <w:rPr>
+                <w:b w:val="0"/>
+                <w:bCs w:val="0"/>
+                <w:lang w:val="en-CA"/>
+              </w:rPr>
+            </w:pPr>
+            <w:r>
+              <w:rPr>
+                <w:b w:val="0"/>
+                <w:bCs w:val="0"/>
+                <w:lang w:val="en-CA"/>
+              </w:rPr>
               <w:t>Support PCFS as they perform data cleanup</w:t>
             </w:r>
           </w:p>
           <w:p>
             <w:pPr>
-              <w:pStyle w:val="Section"/>
-              <w:rPr>
-                <w:b/>
-                <w:bCs/>
-                <w:lang w:val="en-CA"/>
-              </w:rPr>
-            </w:pPr>
-            <w:r>
-              <w:t>Execute trial data migrations in a sandbox environment</w:t>
-            </w:r>
-          </w:p>
-          <w:p>
-            <w:pPr>
-              <w:pStyle w:val="Section"/>
-              <w:rPr>
-                <w:b/>
-                <w:bCs/>
-                <w:lang w:val="en-CA"/>
-              </w:rPr>
-            </w:pPr>
-            <w:r>
-              <w:t>Perform live data migration</w:t>
+              <w:pStyle w:val="list1"/>
+              <w:rPr>
+                <w:b w:val="0"/>
+                <w:bCs w:val="0"/>
+                <w:lang w:val="en-CA"/>
+              </w:rPr>
+            </w:pPr>
+            <w:r>
+              <w:rPr>
+                <w:b w:val="0"/>
+                <w:bCs w:val="0"/>
+                <w:lang w:val="en-CA"/>
+              </w:rPr>
+              <w:t xml:space="preserve">Execute trial data migrations in a sandbox environment </w:t>
+            </w:r>
+          </w:p>
+          <w:p>
+            <w:pPr>
+              <w:pStyle w:val="list1"/>
+              <w:rPr>
+                <w:b w:val="0"/>
+                <w:bCs w:val="0"/>
+                <w:lang w:val="en-CA"/>
+              </w:rPr>
+            </w:pPr>
+            <w:r>
+              <w:rPr>
+                <w:b w:val="0"/>
+                <w:bCs w:val="0"/>
+                <w:lang w:val="en-CA"/>
+              </w:rPr>
+              <w:t xml:space="preserve">Perform live data migration </w:t>
             </w:r>
           </w:p>
         </w:tc>

</xml_diff>